<commit_message>
refactor: scrap web portal in favor of pure GAM command center and sidebar
</commit_message>
<xml_diff>
--- a/dist/Devoteam-GWS-Email-Purge-Customer-Bundle/01-Customer-Deployment-Guide.docx
+++ b/dist/Devoteam-GWS-Email-Purge-Customer-Bundle/01-Customer-Deployment-Guide.docx
@@ -608,7 +608,7 @@
                 <w:b/>
                 <w:sz w:val="17"/>
               </w:rPr>
-              <w:t>03-Apps-Script-Web-Solution</w:t>
+              <w:t>03-Apps-Script-Command-Center</w:t>
             </w:r>
           </w:p>
         </w:tc>
@@ -650,7 +650,7 @@
                 <w:rFonts w:ascii="Montserrat" w:hAnsi="Montserrat"/>
                 <w:sz w:val="17"/>
               </w:rPr>
-              <w:t>Production 1-click web portal (Dashboard.html) &amp; backend controller (Code.gs).</w:t>
+              <w:t>Interactive Google Sheets GAM Command Builder (Sidebar.html) &amp; controller (Code.gs).</w:t>
             </w:r>
           </w:p>
         </w:tc>
@@ -804,7 +804,7 @@
           <w:color w:val="3C3C3A"/>
           <w:sz w:val="28"/>
         </w:rPr>
-        <w:t>3. System Architecture &amp; Dual Execution Model</w:t>
+        <w:t>3. System Architecture &amp; GAM Command Center</w:t>
       </w:r>
     </w:p>
     <w:p>
@@ -812,12 +812,12 @@
         <w:spacing w:after="160"/>
       </w:pPr>
       <w:r>
-        <w:t>The architecture decouples the presentation interface from the Google Cloud execution plane to maintain least privilege:</w:t>
+        <w:t>The architecture decouples the presentation interface from the Google Cloud execution plane to maintain least privilege and maximum throughput:</w:t>
         <w:br/>
         <w:br/>
-        <w:t>• Presentation Layer (Control Plane): Built with Google Apps Script (HTML5/CSS3). Accessible directly within Google Sheets as a modal dialog or deployed as an independent Web App URL bound to corporate Google SSO.</w:t>
+        <w:t>• Presentation Layer (Control Plane): Built with Google Apps Script (HTML5/CSS3). Accessible directly within Google Sheets as an interactive Quick Sidebar command generator (Sidebar.html) and Incident Response Control Center.</w:t>
         <w:br/>
-        <w:t>• Execution Layer (Data Plane): The backend Controller utilizes Domain-Wide Delegation (DWD). It dynamically mints short-lived OAuth 2.0 access tokens signed with RS256 using a Google Cloud Service Account private key stored in Google's encrypted ScriptProperties. It then calls the Gmail REST API (v1) to surgically trash or expunge target messages.</w:t>
+        <w:t>• Execution Layer (Data Plane): The command generator dynamically builds syntax-validated, safety-checked GAM CLI commands. GAM runs locally with multi-threading, native group expansion, and without Apps Script execution timeout constraints.</w:t>
         <w:br/>
         <w:t>• Security &amp; Audit Plane: All incident queries, operator emails, target mailboxes, and cryptographic SHA-256 hashes are immutably logged to the 'Audit_Log' tab. Zero email body text or attachment payloads are ever logged, strictly adhering to GDPR and PII compliance.</w:t>
       </w:r>
@@ -890,7 +890,7 @@
         <w:rPr>
           <w:sz w:val="19"/>
         </w:rPr>
-        <w:t>Replace the default code in Code.gs with the file provided in 03-Apps-Script-Web-Solution/Code.gs.</w:t>
+        <w:t>Replace default code in Code.gs with the file provided in 03-Apps-Script-Command-Center/Code.gs.</w:t>
       </w:r>
     </w:p>
     <w:p>
@@ -903,13 +903,13 @@
           <w:color w:val="F8485E"/>
           <w:sz w:val="19"/>
         </w:rPr>
-        <w:t xml:space="preserve">✔  Step 4: Add Dashboard.html: </w:t>
+        <w:t xml:space="preserve">✔  Step 4: Add Sidebar.html: </w:t>
       </w:r>
       <w:r>
         <w:rPr>
           <w:sz w:val="19"/>
         </w:rPr>
-        <w:t>In Apps Script, click '+' next to Files &gt; HTML, name it 'Dashboard', and paste the contents of Dashboard.html.</w:t>
+        <w:t>In Apps Script, click '+' next to Files &gt; HTML, name it 'Sidebar', and paste the contents of Sidebar.html. Save the project (Cmd+S / Ctrl+S).</w:t>
       </w:r>
     </w:p>
     <w:p>
@@ -922,32 +922,13 @@
           <w:color w:val="F8485E"/>
           <w:sz w:val="19"/>
         </w:rPr>
-        <w:t xml:space="preserve">✔  Step 5: (Optional) Add Sidebar.html: </w:t>
+        <w:t xml:space="preserve">✔  Step 5: Initialize Sheet &amp; Launch: </w:t>
       </w:r>
       <w:r>
         <w:rPr>
           <w:sz w:val="19"/>
         </w:rPr>
-        <w:t>Click '+' &gt; HTML, name it 'Sidebar', and paste the contents of Sidebar.html. Save the project (Cmd+S / Ctrl+S).</w:t>
-      </w:r>
-    </w:p>
-    <w:p>
-      <w:pPr>
-        <w:spacing w:before="80" w:after="80"/>
-      </w:pPr>
-      <w:r>
-        <w:rPr>
-          <w:b/>
-          <w:color w:val="F8485E"/>
-          <w:sz w:val="19"/>
-        </w:rPr>
-        <w:t xml:space="preserve">✔  Step 6: Initialize Sheet &amp; Launch: </w:t>
-      </w:r>
-      <w:r>
-        <w:rPr>
-          <w:sz w:val="19"/>
-        </w:rPr>
-        <w:t>Refresh your Google Sheet. Click '⚡ GAM Email Purge' in the menu &gt; '⚙️ Initialize / Format Sheet Tabs'. Then click '🚀 Open Purge Web Portal' to begin!</w:t>
+        <w:t>Refresh your Google Sheet. Click '⚡ GAM Email Purge' in the menu &gt; '⚙️ Initialize / Format Sheet Tabs'. Then click '📱 Open GAM Command Builder (Sidebar)' to begin!</w:t>
       </w:r>
     </w:p>
     <w:tbl>

</xml_diff>